<commit_message>
Video link and repo link updated
</commit_message>
<xml_diff>
--- a/Project_report_end_sem.docx
+++ b/Project_report_end_sem.docx
@@ -1842,7 +1842,7 @@
         <w:pStyle w:val="ListBullet"/>
       </w:pPr>
       <w:r>
-        <w:t>GitHub Repository: https://github.com/TheSpideX/liberty-twin</w:t>
+        <w:t>GitHub Repository: https://github.com/SpideXD/IotProject</w:t>
       </w:r>
     </w:p>
     <w:p>
@@ -1866,7 +1866,7 @@
         <w:pStyle w:val="ListBullet"/>
       </w:pPr>
       <w:r>
-        <w:t>Demo Video: https://drive.google.com/drive/folders/12_o5Q8x0iKpvJoQKwMnbd5_4B8_u7Mhl</w:t>
+        <w:t>Demo Video: https://drive.google.com/drive/folders/1QJ-Gg91P5NUIVUFy-l_mHb20-7Z3XkRm?usp=sharing</w:t>
       </w:r>
     </w:p>
     <w:p>

</xml_diff>